<commit_message>
Sprint 00-10: Complete Query Execution Foundation
</commit_message>
<xml_diff>
--- a/docs/Design/YEKDB_00-07_Table_Management_Layer.docx
+++ b/docs/Design/YEKDB_00-07_Table_Management_Layer.docx
@@ -11,7 +11,7 @@
         <w:t>YEKDB 00-0</w:t>
       </w:r>
       <w:r>
-        <w:t>6</w:t>
+        <w:t>7</w:t>
       </w:r>
       <w:r>
         <w:br/>
@@ -27,56 +27,12 @@
       <w:pPr>
         <w:jc w:val="center"/>
       </w:pPr>
-      <w:proofErr w:type="spellStart"/>
       <w:r>
         <w:rPr>
           <w:i/>
         </w:rPr>
-        <w:t>Tasarım</w:t>
-      </w:r>
-      <w:proofErr w:type="spellEnd"/>
-      <w:r>
-        <w:rPr>
-          <w:i/>
-        </w:rPr>
-        <w:t xml:space="preserve"> ve </w:t>
-      </w:r>
-      <w:proofErr w:type="spellStart"/>
-      <w:r>
-        <w:rPr>
-          <w:i/>
-        </w:rPr>
-        <w:t>Mimari</w:t>
-      </w:r>
-      <w:proofErr w:type="spellEnd"/>
-      <w:r>
-        <w:rPr>
-          <w:i/>
-        </w:rPr>
-        <w:t xml:space="preserve"> </w:t>
-      </w:r>
-      <w:proofErr w:type="spellStart"/>
-      <w:r>
-        <w:rPr>
-          <w:i/>
-        </w:rPr>
-        <w:t>Açıklama</w:t>
-      </w:r>
-      <w:proofErr w:type="spellEnd"/>
-      <w:r>
-        <w:rPr>
-          <w:i/>
-        </w:rPr>
-        <w:t xml:space="preserve"> </w:t>
-      </w:r>
-      <w:proofErr w:type="spellStart"/>
-      <w:r>
-        <w:rPr>
-          <w:i/>
-        </w:rPr>
-        <w:t>Dokümanı</w:t>
-      </w:r>
-      <w:proofErr w:type="spellEnd"/>
+        <w:t>Tasarım ve Mimari Açıklama Dokümanı</w:t>
+      </w:r>
     </w:p>
     <w:tbl>
       <w:tblPr>
@@ -103,16 +59,8 @@
               <w:rPr>
                 <w:b/>
               </w:rPr>
-              <w:t xml:space="preserve">Ad ve </w:t>
+              <w:t>Ad ve Soyadı</w:t>
             </w:r>
-            <w:proofErr w:type="spellStart"/>
-            <w:r>
-              <w:rPr>
-                <w:b/>
-              </w:rPr>
-              <w:t>Soyadı</w:t>
-            </w:r>
-            <w:proofErr w:type="spellEnd"/>
           </w:p>
         </w:tc>
         <w:tc>
@@ -137,56 +85,12 @@
             <w:vAlign w:val="center"/>
           </w:tcPr>
           <w:p>
-            <w:proofErr w:type="spellStart"/>
             <w:r>
               <w:rPr>
                 <w:b/>
               </w:rPr>
               <w:t>Bölüm</w:t>
             </w:r>
-            <w:proofErr w:type="spellEnd"/>
-          </w:p>
-        </w:tc>
-        <w:tc>
-          <w:tcPr>
-            <w:tcW w:w="4896" w:type="dxa"/>
-            <w:vAlign w:val="center"/>
-          </w:tcPr>
-          <w:p>
-            <w:proofErr w:type="spellStart"/>
-            <w:r>
-              <w:t>Bilgisayar</w:t>
-            </w:r>
-            <w:proofErr w:type="spellEnd"/>
-            <w:r>
-              <w:t xml:space="preserve"> </w:t>
-            </w:r>
-            <w:proofErr w:type="spellStart"/>
-            <w:r>
-              <w:t>Mühendisliği</w:t>
-            </w:r>
-            <w:proofErr w:type="spellEnd"/>
-          </w:p>
-        </w:tc>
-      </w:tr>
-      <w:tr>
-        <w:trPr>
-          <w:jc w:val="center"/>
-        </w:trPr>
-        <w:tc>
-          <w:tcPr>
-            <w:tcW w:w="4896" w:type="dxa"/>
-            <w:vAlign w:val="center"/>
-          </w:tcPr>
-          <w:p>
-            <w:proofErr w:type="spellStart"/>
-            <w:r>
-              <w:rPr>
-                <w:b/>
-              </w:rPr>
-              <w:t>Proje</w:t>
-            </w:r>
-            <w:proofErr w:type="spellEnd"/>
           </w:p>
         </w:tc>
         <w:tc>
@@ -196,23 +100,7 @@
           </w:tcPr>
           <w:p>
             <w:r>
-              <w:t xml:space="preserve">YEKDB - </w:t>
-            </w:r>
-            <w:proofErr w:type="spellStart"/>
-            <w:r>
-              <w:t>Sıfırdan</w:t>
-            </w:r>
-            <w:proofErr w:type="spellEnd"/>
-            <w:r>
-              <w:t xml:space="preserve"> </w:t>
-            </w:r>
-            <w:proofErr w:type="spellStart"/>
-            <w:r>
-              <w:t>Veritabanı</w:t>
-            </w:r>
-            <w:proofErr w:type="spellEnd"/>
-            <w:r>
-              <w:t xml:space="preserve"> Yönetim Sistemi</w:t>
+              <w:t>Bilgisayar Mühendisliği</w:t>
             </w:r>
           </w:p>
         </w:tc>
@@ -227,19 +115,41 @@
             <w:vAlign w:val="center"/>
           </w:tcPr>
           <w:p>
-            <w:proofErr w:type="spellStart"/>
             <w:r>
               <w:rPr>
                 <w:b/>
               </w:rPr>
-              <w:t>Doküman</w:t>
+              <w:t>Proje</w:t>
             </w:r>
-            <w:proofErr w:type="spellEnd"/>
+          </w:p>
+        </w:tc>
+        <w:tc>
+          <w:tcPr>
+            <w:tcW w:w="4896" w:type="dxa"/>
+            <w:vAlign w:val="center"/>
+          </w:tcPr>
+          <w:p>
+            <w:r>
+              <w:t>YEKDB - Sıfırdan Veritabanı Yönetim Sistemi</w:t>
+            </w:r>
+          </w:p>
+        </w:tc>
+      </w:tr>
+      <w:tr>
+        <w:trPr>
+          <w:jc w:val="center"/>
+        </w:trPr>
+        <w:tc>
+          <w:tcPr>
+            <w:tcW w:w="4896" w:type="dxa"/>
+            <w:vAlign w:val="center"/>
+          </w:tcPr>
+          <w:p>
             <w:r>
               <w:rPr>
                 <w:b/>
               </w:rPr>
-              <w:t xml:space="preserve"> Kodu</w:t>
+              <w:t>Doküman Kodu</w:t>
             </w:r>
           </w:p>
         </w:tc>
@@ -268,14 +178,12 @@
             <w:vAlign w:val="center"/>
           </w:tcPr>
           <w:p>
-            <w:proofErr w:type="spellStart"/>
             <w:r>
               <w:rPr>
                 <w:b/>
               </w:rPr>
               <w:t>Aşama</w:t>
             </w:r>
-            <w:proofErr w:type="spellEnd"/>
           </w:p>
         </w:tc>
         <w:tc>
@@ -333,76 +241,20 @@
         <w:rPr>
           <w:lang w:val="tr-TR"/>
         </w:rPr>
-        <w:t xml:space="preserve">Sprint 00-07 kapsamında YEKDB içerisine </w:t>
-      </w:r>
-      <w:proofErr w:type="spellStart"/>
-      <w:r>
-        <w:rPr>
-          <w:lang w:val="tr-TR"/>
-        </w:rPr>
-        <w:t>Table</w:t>
-      </w:r>
-      <w:proofErr w:type="spellEnd"/>
-      <w:r>
-        <w:rPr>
-          <w:lang w:val="tr-TR"/>
-        </w:rPr>
-        <w:t xml:space="preserve"> Management </w:t>
-      </w:r>
-      <w:proofErr w:type="spellStart"/>
-      <w:r>
-        <w:rPr>
-          <w:lang w:val="tr-TR"/>
-        </w:rPr>
-        <w:t>Layer</w:t>
-      </w:r>
-      <w:proofErr w:type="spellEnd"/>
-      <w:r>
-        <w:rPr>
-          <w:lang w:val="tr-TR"/>
-        </w:rPr>
-        <w:t xml:space="preserve"> eklenmiştir.</w:t>
-      </w:r>
-    </w:p>
-    <w:p>
-      <w:pPr>
-        <w:rPr>
-          <w:lang w:val="tr-TR"/>
-        </w:rPr>
-      </w:pPr>
-      <w:r>
-        <w:rPr>
-          <w:lang w:val="tr-TR"/>
-        </w:rPr>
-        <w:t xml:space="preserve">Bu katman sayesinde sistem artık yalnızca </w:t>
-      </w:r>
-      <w:proofErr w:type="spellStart"/>
-      <w:r>
-        <w:rPr>
-          <w:lang w:val="tr-TR"/>
-        </w:rPr>
-        <w:t>veritabanı</w:t>
-      </w:r>
-      <w:proofErr w:type="spellEnd"/>
-      <w:r>
-        <w:rPr>
-          <w:lang w:val="tr-TR"/>
-        </w:rPr>
-        <w:t xml:space="preserve"> oluşturabilen bir yapı olmaktan çıkmış, aynı zamanda ilişkisel tabloları tanımlayabilen ve yönetebilen bir </w:t>
-      </w:r>
-      <w:proofErr w:type="spellStart"/>
-      <w:r>
-        <w:rPr>
-          <w:lang w:val="tr-TR"/>
-        </w:rPr>
-        <w:t>veritabanı</w:t>
-      </w:r>
-      <w:proofErr w:type="spellEnd"/>
-      <w:r>
-        <w:rPr>
-          <w:lang w:val="tr-TR"/>
-        </w:rPr>
-        <w:t xml:space="preserve"> yönetim sistemine dönüşmüştür.</w:t>
+        <w:t>Sprint 00-07 kapsamında YEKDB içerisine Table Management Layer eklenmiştir.</w:t>
+      </w:r>
+    </w:p>
+    <w:p>
+      <w:pPr>
+        <w:rPr>
+          <w:lang w:val="tr-TR"/>
+        </w:rPr>
+      </w:pPr>
+      <w:r>
+        <w:rPr>
+          <w:lang w:val="tr-TR"/>
+        </w:rPr>
+        <w:t>Bu katman sayesinde sistem artık yalnızca veritabanı oluşturabilen bir yapı olmaktan çıkmış, aynı zamanda ilişkisel tabloları tanımlayabilen ve yönetebilen bir veritabanı yönetim sistemine dönüşmüştür.</w:t>
       </w:r>
     </w:p>
     <w:p>
@@ -429,21 +281,7 @@
         <w:rPr>
           <w:lang w:val="tr-TR"/>
         </w:rPr>
-        <w:t xml:space="preserve">2. </w:t>
-      </w:r>
-      <w:proofErr w:type="spellStart"/>
-      <w:r>
-        <w:rPr>
-          <w:lang w:val="tr-TR"/>
-        </w:rPr>
-        <w:t>Table</w:t>
-      </w:r>
-      <w:proofErr w:type="spellEnd"/>
-      <w:r>
-        <w:rPr>
-          <w:lang w:val="tr-TR"/>
-        </w:rPr>
-        <w:t xml:space="preserve"> Management Katmanının Amacı</w:t>
+        <w:t>2. Table Management Katmanının Amacı</w:t>
       </w:r>
     </w:p>
     <w:p>
@@ -554,16 +392,8 @@
         <w:rPr>
           <w:lang w:val="tr-TR"/>
         </w:rPr>
-        <w:t>fiziksel .</w:t>
-      </w:r>
-      <w:proofErr w:type="spellStart"/>
-      <w:r>
-        <w:rPr>
-          <w:lang w:val="tr-TR"/>
-        </w:rPr>
-        <w:t>tbl</w:t>
-      </w:r>
-      <w:proofErr w:type="spellEnd"/>
+        <w:t>fiziksel .tbl</w:t>
+      </w:r>
       <w:proofErr w:type="gramEnd"/>
       <w:r>
         <w:rPr>
@@ -672,7 +502,6 @@
           <w:lang w:val="tr-TR"/>
         </w:rPr>
       </w:pPr>
-      <w:proofErr w:type="spellStart"/>
       <w:r>
         <w:rPr>
           <w:lang w:val="tr-TR"/>
@@ -680,7 +509,6 @@
         <w:lastRenderedPageBreak/>
         <w:t>TableManager</w:t>
       </w:r>
-      <w:proofErr w:type="spellEnd"/>
     </w:p>
     <w:p>
       <w:pPr>
@@ -715,14 +543,12 @@
           <w:lang w:val="tr-TR"/>
         </w:rPr>
       </w:pPr>
-      <w:proofErr w:type="spellStart"/>
       <w:r>
         <w:rPr>
           <w:lang w:val="tr-TR"/>
         </w:rPr>
         <w:t>Table</w:t>
       </w:r>
-      <w:proofErr w:type="spellEnd"/>
     </w:p>
     <w:p>
       <w:pPr>
@@ -743,14 +569,12 @@
           <w:lang w:val="tr-TR"/>
         </w:rPr>
       </w:pPr>
-      <w:proofErr w:type="spellStart"/>
       <w:r>
         <w:rPr>
           <w:lang w:val="tr-TR"/>
         </w:rPr>
         <w:t>Column</w:t>
       </w:r>
-      <w:proofErr w:type="spellEnd"/>
     </w:p>
     <w:p>
       <w:pPr>
@@ -771,14 +595,12 @@
           <w:lang w:val="tr-TR"/>
         </w:rPr>
       </w:pPr>
-      <w:proofErr w:type="spellStart"/>
       <w:r>
         <w:rPr>
           <w:lang w:val="tr-TR"/>
         </w:rPr>
         <w:t>TableCatalog</w:t>
       </w:r>
-      <w:proofErr w:type="spellEnd"/>
     </w:p>
     <w:p>
       <w:pPr>
@@ -799,14 +621,12 @@
           <w:lang w:val="tr-TR"/>
         </w:rPr>
       </w:pPr>
-      <w:proofErr w:type="spellStart"/>
       <w:r>
         <w:rPr>
           <w:lang w:val="tr-TR"/>
         </w:rPr>
         <w:t>TableMetadata</w:t>
       </w:r>
-      <w:proofErr w:type="spellEnd"/>
     </w:p>
     <w:p>
       <w:pPr>
@@ -827,33 +647,11 @@
           <w:lang w:val="tr-TR"/>
         </w:rPr>
       </w:pPr>
-      <w:proofErr w:type="spellStart"/>
-      <w:r>
-        <w:rPr>
-          <w:lang w:val="tr-TR"/>
-        </w:rPr>
-        <w:t>Physical</w:t>
-      </w:r>
-      <w:proofErr w:type="spellEnd"/>
-      <w:r>
-        <w:rPr>
-          <w:lang w:val="tr-TR"/>
-        </w:rPr>
-        <w:t xml:space="preserve"> Storage (.</w:t>
-      </w:r>
-      <w:proofErr w:type="spellStart"/>
-      <w:r>
-        <w:rPr>
-          <w:lang w:val="tr-TR"/>
-        </w:rPr>
-        <w:t>tbl</w:t>
-      </w:r>
-      <w:proofErr w:type="spellEnd"/>
-      <w:r>
-        <w:rPr>
-          <w:lang w:val="tr-TR"/>
-        </w:rPr>
-        <w:t>)</w:t>
+      <w:r>
+        <w:rPr>
+          <w:lang w:val="tr-TR"/>
+        </w:rPr>
+        <w:t>Physical Storage (.tbl)</w:t>
       </w:r>
     </w:p>
     <w:p>
@@ -867,7 +665,7 @@
           <w:lang w:val="tr-TR"/>
         </w:rPr>
         <w:pict w14:anchorId="29E8F104">
-          <v:rect id="_x0000_i1149" style="width:0;height:1.5pt" o:hralign="center" o:hrstd="t" o:hr="t" fillcolor="#a0a0a0" stroked="f"/>
+          <v:rect id="_x0000_i1025" style="width:0;height:1.5pt" o:hralign="center" o:hrstd="t" o:hr="t" fillcolor="#a0a0a0" stroked="f"/>
         </w:pict>
       </w:r>
     </w:p>
@@ -890,7 +688,6 @@
           <w:lang w:val="tr-TR"/>
         </w:rPr>
       </w:pPr>
-      <w:proofErr w:type="spellStart"/>
       <w:proofErr w:type="gramStart"/>
       <w:r>
         <w:rPr>
@@ -905,7 +702,6 @@
         </w:rPr>
         <w:t>.table</w:t>
       </w:r>
-      <w:proofErr w:type="spellEnd"/>
     </w:p>
     <w:p>
       <w:pPr>
@@ -951,16 +747,8 @@
         <w:rPr>
           <w:lang w:val="tr-TR"/>
         </w:rPr>
-        <w:t xml:space="preserve"> </w:t>
-      </w:r>
-      <w:proofErr w:type="spellStart"/>
-      <w:r>
-        <w:rPr>
-          <w:lang w:val="tr-TR"/>
-        </w:rPr>
-        <w:t>DataType</w:t>
-      </w:r>
-      <w:proofErr w:type="spellEnd"/>
+        <w:t xml:space="preserve"> DataType</w:t>
+      </w:r>
     </w:p>
     <w:p>
       <w:pPr>
@@ -986,16 +774,8 @@
         <w:rPr>
           <w:lang w:val="tr-TR"/>
         </w:rPr>
-        <w:t xml:space="preserve"> </w:t>
-      </w:r>
-      <w:proofErr w:type="spellStart"/>
-      <w:r>
-        <w:rPr>
-          <w:lang w:val="tr-TR"/>
-        </w:rPr>
-        <w:t>Column</w:t>
-      </w:r>
-      <w:proofErr w:type="spellEnd"/>
+        <w:t xml:space="preserve"> Column</w:t>
+      </w:r>
     </w:p>
     <w:p>
       <w:pPr>
@@ -1021,16 +801,8 @@
         <w:rPr>
           <w:lang w:val="tr-TR"/>
         </w:rPr>
-        <w:t xml:space="preserve"> </w:t>
-      </w:r>
-      <w:proofErr w:type="spellStart"/>
-      <w:r>
-        <w:rPr>
-          <w:lang w:val="tr-TR"/>
-        </w:rPr>
-        <w:t>Table</w:t>
-      </w:r>
-      <w:proofErr w:type="spellEnd"/>
+        <w:t xml:space="preserve"> Table</w:t>
+      </w:r>
     </w:p>
     <w:p>
       <w:pPr>
@@ -1056,16 +828,8 @@
         <w:rPr>
           <w:lang w:val="tr-TR"/>
         </w:rPr>
-        <w:t xml:space="preserve"> </w:t>
-      </w:r>
-      <w:proofErr w:type="spellStart"/>
-      <w:r>
-        <w:rPr>
-          <w:lang w:val="tr-TR"/>
-        </w:rPr>
-        <w:t>TableMetadata</w:t>
-      </w:r>
-      <w:proofErr w:type="spellEnd"/>
+        <w:t xml:space="preserve"> TableMetadata</w:t>
+      </w:r>
     </w:p>
     <w:p>
       <w:pPr>
@@ -1091,16 +855,8 @@
         <w:rPr>
           <w:lang w:val="tr-TR"/>
         </w:rPr>
-        <w:t xml:space="preserve"> </w:t>
-      </w:r>
-      <w:proofErr w:type="spellStart"/>
-      <w:r>
-        <w:rPr>
-          <w:lang w:val="tr-TR"/>
-        </w:rPr>
-        <w:t>TableCatalog</w:t>
-      </w:r>
-      <w:proofErr w:type="spellEnd"/>
+        <w:t xml:space="preserve"> TableCatalog</w:t>
+      </w:r>
     </w:p>
     <w:p>
       <w:pPr>
@@ -1126,16 +882,8 @@
         <w:rPr>
           <w:lang w:val="tr-TR"/>
         </w:rPr>
-        <w:t xml:space="preserve"> </w:t>
-      </w:r>
-      <w:proofErr w:type="spellStart"/>
-      <w:r>
-        <w:rPr>
-          <w:lang w:val="tr-TR"/>
-        </w:rPr>
-        <w:t>TableManager</w:t>
-      </w:r>
-      <w:proofErr w:type="spellEnd"/>
+        <w:t xml:space="preserve"> TableManager</w:t>
+      </w:r>
     </w:p>
     <w:p>
       <w:pPr>
@@ -1160,16 +908,8 @@
         <w:rPr>
           <w:lang w:val="tr-TR"/>
         </w:rPr>
-        <w:t xml:space="preserve">└── </w:t>
-      </w:r>
-      <w:proofErr w:type="spellStart"/>
-      <w:r>
-        <w:rPr>
-          <w:lang w:val="tr-TR"/>
-        </w:rPr>
-        <w:t>exception</w:t>
-      </w:r>
-      <w:proofErr w:type="spellEnd"/>
+        <w:t>└── exception</w:t>
+      </w:r>
     </w:p>
     <w:p>
       <w:pPr>
@@ -1201,16 +941,8 @@
         <w:rPr>
           <w:lang w:val="tr-TR"/>
         </w:rPr>
-        <w:t xml:space="preserve"> </w:t>
-      </w:r>
-      <w:proofErr w:type="spellStart"/>
-      <w:r>
-        <w:rPr>
-          <w:lang w:val="tr-TR"/>
-        </w:rPr>
-        <w:t>TableAlreadyExistsException</w:t>
-      </w:r>
-      <w:proofErr w:type="spellEnd"/>
+        <w:t xml:space="preserve"> TableAlreadyExistsException</w:t>
+      </w:r>
     </w:p>
     <w:p>
       <w:pPr>
@@ -1243,16 +975,8 @@
         <w:rPr>
           <w:lang w:val="tr-TR"/>
         </w:rPr>
-        <w:t xml:space="preserve"> </w:t>
-      </w:r>
-      <w:proofErr w:type="spellStart"/>
-      <w:r>
-        <w:rPr>
-          <w:lang w:val="tr-TR"/>
-        </w:rPr>
-        <w:t>TableNotFoundException</w:t>
-      </w:r>
-      <w:proofErr w:type="spellEnd"/>
+        <w:t xml:space="preserve"> TableNotFoundException</w:t>
+      </w:r>
     </w:p>
     <w:p>
       <w:pPr>
@@ -1284,37 +1008,21 @@
         <w:rPr>
           <w:lang w:val="tr-TR"/>
         </w:rPr>
-        <w:t xml:space="preserve"> </w:t>
-      </w:r>
-      <w:proofErr w:type="spellStart"/>
-      <w:r>
-        <w:rPr>
-          <w:lang w:val="tr-TR"/>
-        </w:rPr>
-        <w:t>DuplicateColumnException</w:t>
-      </w:r>
-      <w:proofErr w:type="spellEnd"/>
-    </w:p>
-    <w:p>
-      <w:pPr>
-        <w:rPr>
-          <w:lang w:val="tr-TR"/>
-        </w:rPr>
-      </w:pPr>
-      <w:r>
-        <w:rPr>
-          <w:lang w:val="tr-TR"/>
-        </w:rPr>
-        <w:t xml:space="preserve">     └── </w:t>
-      </w:r>
-      <w:proofErr w:type="spellStart"/>
-      <w:r>
-        <w:rPr>
-          <w:lang w:val="tr-TR"/>
-        </w:rPr>
-        <w:t>InvalidColumnException</w:t>
-      </w:r>
-      <w:proofErr w:type="spellEnd"/>
+        <w:t xml:space="preserve"> DuplicateColumnException</w:t>
+      </w:r>
+    </w:p>
+    <w:p>
+      <w:pPr>
+        <w:rPr>
+          <w:lang w:val="tr-TR"/>
+        </w:rPr>
+      </w:pPr>
+      <w:r>
+        <w:rPr>
+          <w:lang w:val="tr-TR"/>
+        </w:rPr>
+        <w:t xml:space="preserve">     └── InvalidColumnException</w:t>
+      </w:r>
     </w:p>
     <w:p>
       <w:pPr>
@@ -1337,40 +1045,24 @@
           <w:lang w:val="tr-TR"/>
         </w:rPr>
       </w:pPr>
-      <w:proofErr w:type="spellStart"/>
       <w:r>
         <w:rPr>
           <w:lang w:val="tr-TR"/>
         </w:rPr>
         <w:t>DataType</w:t>
       </w:r>
-      <w:proofErr w:type="spellEnd"/>
-    </w:p>
-    <w:p>
-      <w:pPr>
-        <w:rPr>
-          <w:lang w:val="tr-TR"/>
-        </w:rPr>
-      </w:pPr>
-      <w:r>
-        <w:rPr>
-          <w:lang w:val="tr-TR"/>
-        </w:rPr>
-        <w:t xml:space="preserve">Sistemde desteklenen veri tiplerini temsil eden </w:t>
-      </w:r>
-      <w:proofErr w:type="spellStart"/>
-      <w:r>
-        <w:rPr>
-          <w:lang w:val="tr-TR"/>
-        </w:rPr>
-        <w:t>enum</w:t>
-      </w:r>
-      <w:proofErr w:type="spellEnd"/>
-      <w:r>
-        <w:rPr>
-          <w:lang w:val="tr-TR"/>
-        </w:rPr>
-        <w:t xml:space="preserve"> yapısıdır.</w:t>
+    </w:p>
+    <w:p>
+      <w:pPr>
+        <w:rPr>
+          <w:lang w:val="tr-TR"/>
+        </w:rPr>
+      </w:pPr>
+      <w:r>
+        <w:rPr>
+          <w:lang w:val="tr-TR"/>
+        </w:rPr>
+        <w:t>Sistemde desteklenen veri tiplerini temsil eden enum yapısıdır.</w:t>
       </w:r>
     </w:p>
     <w:p>
@@ -1501,14 +1193,12 @@
           <w:lang w:val="tr-TR"/>
         </w:rPr>
       </w:pPr>
-      <w:proofErr w:type="spellStart"/>
       <w:r>
         <w:rPr>
           <w:lang w:val="tr-TR"/>
         </w:rPr>
         <w:t>Column</w:t>
       </w:r>
-      <w:proofErr w:type="spellEnd"/>
     </w:p>
     <w:p>
       <w:pPr>
@@ -1625,7 +1315,6 @@
           <w:lang w:val="tr-TR"/>
         </w:rPr>
       </w:pPr>
-      <w:proofErr w:type="spellStart"/>
       <w:proofErr w:type="gramStart"/>
       <w:r>
         <w:rPr>
@@ -1633,7 +1322,6 @@
         </w:rPr>
         <w:t>immutable</w:t>
       </w:r>
-      <w:proofErr w:type="spellEnd"/>
       <w:proofErr w:type="gramEnd"/>
       <w:r>
         <w:rPr>
@@ -1649,40 +1337,24 @@
           <w:lang w:val="tr-TR"/>
         </w:rPr>
       </w:pPr>
-      <w:proofErr w:type="spellStart"/>
       <w:r>
         <w:rPr>
           <w:lang w:val="tr-TR"/>
         </w:rPr>
         <w:t>Table</w:t>
       </w:r>
-      <w:proofErr w:type="spellEnd"/>
-    </w:p>
-    <w:p>
-      <w:pPr>
-        <w:rPr>
-          <w:lang w:val="tr-TR"/>
-        </w:rPr>
-      </w:pPr>
-      <w:r>
-        <w:rPr>
-          <w:lang w:val="tr-TR"/>
-        </w:rPr>
-        <w:t xml:space="preserve">Bir </w:t>
-      </w:r>
-      <w:proofErr w:type="spellStart"/>
-      <w:r>
-        <w:rPr>
-          <w:lang w:val="tr-TR"/>
-        </w:rPr>
-        <w:t>veritabanı</w:t>
-      </w:r>
-      <w:proofErr w:type="spellEnd"/>
-      <w:r>
-        <w:rPr>
-          <w:lang w:val="tr-TR"/>
-        </w:rPr>
-        <w:t xml:space="preserve"> tablosunun şemasını temsil eder.</w:t>
+    </w:p>
+    <w:p>
+      <w:pPr>
+        <w:rPr>
+          <w:lang w:val="tr-TR"/>
+        </w:rPr>
+      </w:pPr>
+      <w:r>
+        <w:rPr>
+          <w:lang w:val="tr-TR"/>
+        </w:rPr>
+        <w:t>Bir veritabanı tablosunun şemasını temsil eder.</w:t>
       </w:r>
     </w:p>
     <w:p>
@@ -1781,21 +1453,7 @@
         <w:rPr>
           <w:lang w:val="tr-TR"/>
         </w:rPr>
-        <w:t xml:space="preserve">Tablo oluşturulurken </w:t>
-      </w:r>
-      <w:proofErr w:type="spellStart"/>
-      <w:r>
-        <w:rPr>
-          <w:lang w:val="tr-TR"/>
-        </w:rPr>
-        <w:t>duplicate</w:t>
-      </w:r>
-      <w:proofErr w:type="spellEnd"/>
-      <w:r>
-        <w:rPr>
-          <w:lang w:val="tr-TR"/>
-        </w:rPr>
-        <w:t xml:space="preserve"> sütunlara izin verilmez.</w:t>
+        <w:t>Tablo oluşturulurken duplicate sütunlara izin verilmez.</w:t>
       </w:r>
     </w:p>
     <w:p>
@@ -1805,14 +1463,12 @@
           <w:lang w:val="tr-TR"/>
         </w:rPr>
       </w:pPr>
-      <w:proofErr w:type="spellStart"/>
       <w:r>
         <w:rPr>
           <w:lang w:val="tr-TR"/>
         </w:rPr>
         <w:t>TableMetadata</w:t>
       </w:r>
-      <w:proofErr w:type="spellEnd"/>
     </w:p>
     <w:p>
       <w:pPr>
@@ -1978,14 +1634,12 @@
           <w:lang w:val="tr-TR"/>
         </w:rPr>
       </w:pPr>
-      <w:proofErr w:type="spellStart"/>
       <w:r>
         <w:rPr>
           <w:lang w:val="tr-TR"/>
         </w:rPr>
         <w:t>TableCatalog</w:t>
       </w:r>
-      <w:proofErr w:type="spellEnd"/>
     </w:p>
     <w:p>
       <w:pPr>
@@ -2150,14 +1804,12 @@
           <w:lang w:val="tr-TR"/>
         </w:rPr>
       </w:pPr>
-      <w:proofErr w:type="spellStart"/>
       <w:r>
         <w:rPr>
           <w:lang w:val="tr-TR"/>
         </w:rPr>
         <w:t>TableManager</w:t>
       </w:r>
-      <w:proofErr w:type="spellEnd"/>
     </w:p>
     <w:p>
       <w:pPr>
@@ -2336,42 +1988,20 @@
         <w:rPr>
           <w:lang w:val="tr-TR"/>
         </w:rPr>
-        <w:t xml:space="preserve">6. </w:t>
-      </w:r>
-      <w:proofErr w:type="spellStart"/>
-      <w:r>
-        <w:rPr>
-          <w:lang w:val="tr-TR"/>
-        </w:rPr>
-        <w:t>TableManager</w:t>
-      </w:r>
-      <w:proofErr w:type="spellEnd"/>
-      <w:r>
-        <w:rPr>
-          <w:lang w:val="tr-TR"/>
-        </w:rPr>
-        <w:t xml:space="preserve"> Tasarımı</w:t>
-      </w:r>
-    </w:p>
-    <w:p>
-      <w:pPr>
-        <w:rPr>
-          <w:lang w:val="tr-TR"/>
-        </w:rPr>
-      </w:pPr>
-      <w:proofErr w:type="spellStart"/>
-      <w:r>
-        <w:rPr>
-          <w:lang w:val="tr-TR"/>
-        </w:rPr>
-        <w:t>TableManager</w:t>
-      </w:r>
-      <w:proofErr w:type="spellEnd"/>
-      <w:r>
-        <w:rPr>
-          <w:lang w:val="tr-TR"/>
-        </w:rPr>
-        <w:t xml:space="preserve"> sistemin servis katmanıdır.</w:t>
+        <w:t>6. TableManager Tasarımı</w:t>
+      </w:r>
+    </w:p>
+    <w:p>
+      <w:pPr>
+        <w:rPr>
+          <w:lang w:val="tr-TR"/>
+        </w:rPr>
+      </w:pPr>
+      <w:r>
+        <w:rPr>
+          <w:lang w:val="tr-TR"/>
+        </w:rPr>
+        <w:t>TableManager sistemin servis katmanıdır.</w:t>
       </w:r>
     </w:p>
     <w:p>
@@ -2393,14 +2023,12 @@
           <w:lang w:val="tr-TR"/>
         </w:rPr>
       </w:pPr>
-      <w:proofErr w:type="spellStart"/>
       <w:r>
         <w:rPr>
           <w:lang w:val="tr-TR"/>
         </w:rPr>
         <w:t>Table</w:t>
       </w:r>
-      <w:proofErr w:type="spellEnd"/>
     </w:p>
     <w:p>
       <w:pPr>
@@ -2478,16 +2106,8 @@
         <w:rPr>
           <w:lang w:val="tr-TR"/>
         </w:rPr>
-        <w:t>.</w:t>
-      </w:r>
-      <w:proofErr w:type="spellStart"/>
-      <w:r>
-        <w:rPr>
-          <w:lang w:val="tr-TR"/>
-        </w:rPr>
-        <w:t>tbl</w:t>
-      </w:r>
-      <w:proofErr w:type="spellEnd"/>
+        <w:t>.tbl</w:t>
+      </w:r>
       <w:proofErr w:type="gramEnd"/>
       <w:r>
         <w:rPr>
@@ -2516,14 +2136,12 @@
           <w:lang w:val="tr-TR"/>
         </w:rPr>
       </w:pPr>
-      <w:proofErr w:type="spellStart"/>
       <w:r>
         <w:rPr>
           <w:lang w:val="tr-TR"/>
         </w:rPr>
         <w:t>Catalog</w:t>
       </w:r>
-      <w:proofErr w:type="spellEnd"/>
     </w:p>
     <w:p>
       <w:pPr>
@@ -2575,42 +2193,20 @@
         <w:rPr>
           <w:lang w:val="tr-TR"/>
         </w:rPr>
-        <w:t xml:space="preserve">7. </w:t>
-      </w:r>
-      <w:proofErr w:type="spellStart"/>
-      <w:r>
-        <w:rPr>
-          <w:lang w:val="tr-TR"/>
-        </w:rPr>
-        <w:t>TableCatalog</w:t>
-      </w:r>
-      <w:proofErr w:type="spellEnd"/>
-      <w:r>
-        <w:rPr>
-          <w:lang w:val="tr-TR"/>
-        </w:rPr>
-        <w:t xml:space="preserve"> Tasarımı</w:t>
-      </w:r>
-    </w:p>
-    <w:p>
-      <w:pPr>
-        <w:rPr>
-          <w:lang w:val="tr-TR"/>
-        </w:rPr>
-      </w:pPr>
-      <w:proofErr w:type="spellStart"/>
-      <w:r>
-        <w:rPr>
-          <w:lang w:val="tr-TR"/>
-        </w:rPr>
-        <w:t>TableCatalog</w:t>
-      </w:r>
-      <w:proofErr w:type="spellEnd"/>
-      <w:r>
-        <w:rPr>
-          <w:lang w:val="tr-TR"/>
-        </w:rPr>
-        <w:t xml:space="preserve"> bellekte çalışan merkezi kayıt sistemidir.</w:t>
+        <w:t>7. TableCatalog Tasarımı</w:t>
+      </w:r>
+    </w:p>
+    <w:p>
+      <w:pPr>
+        <w:rPr>
+          <w:lang w:val="tr-TR"/>
+        </w:rPr>
+      </w:pPr>
+      <w:r>
+        <w:rPr>
+          <w:lang w:val="tr-TR"/>
+        </w:rPr>
+        <w:t>TableCatalog bellekte çalışan merkezi kayıt sistemidir.</w:t>
       </w:r>
     </w:p>
     <w:p>
@@ -2755,21 +2351,7 @@
         <w:rPr>
           <w:lang w:val="tr-TR"/>
         </w:rPr>
-        <w:t xml:space="preserve">8. </w:t>
-      </w:r>
-      <w:proofErr w:type="spellStart"/>
-      <w:r>
-        <w:rPr>
-          <w:lang w:val="tr-TR"/>
-        </w:rPr>
-        <w:t>TableMetadata</w:t>
-      </w:r>
-      <w:proofErr w:type="spellEnd"/>
-      <w:r>
-        <w:rPr>
-          <w:lang w:val="tr-TR"/>
-        </w:rPr>
-        <w:t xml:space="preserve"> Tasarımı</w:t>
+        <w:t>8. TableMetadata Tasarımı</w:t>
       </w:r>
     </w:p>
     <w:p>
@@ -2797,19 +2379,11 @@
           <w:lang w:val="tr-TR"/>
         </w:rPr>
       </w:pPr>
-      <w:proofErr w:type="spellStart"/>
-      <w:r>
-        <w:rPr>
-          <w:lang w:val="tr-TR"/>
-        </w:rPr>
-        <w:t>Table</w:t>
-      </w:r>
-      <w:proofErr w:type="spellEnd"/>
-      <w:r>
-        <w:rPr>
-          <w:lang w:val="tr-TR"/>
-        </w:rPr>
-        <w:t xml:space="preserve"> Name</w:t>
+      <w:r>
+        <w:rPr>
+          <w:lang w:val="tr-TR"/>
+        </w:rPr>
+        <w:t>Table Name</w:t>
       </w:r>
     </w:p>
     <w:p>
@@ -2843,28 +2417,12 @@
           <w:lang w:val="tr-TR"/>
         </w:rPr>
       </w:pPr>
-      <w:proofErr w:type="spellStart"/>
-      <w:r>
-        <w:rPr>
-          <w:lang w:val="tr-TR"/>
-        </w:rPr>
-        <w:t>Column</w:t>
-      </w:r>
-      <w:proofErr w:type="spellEnd"/>
-      <w:r>
-        <w:rPr>
-          <w:lang w:val="tr-TR"/>
-        </w:rPr>
-        <w:t xml:space="preserve"> </w:t>
-      </w:r>
-      <w:proofErr w:type="spellStart"/>
-      <w:r>
-        <w:rPr>
-          <w:lang w:val="tr-TR"/>
-        </w:rPr>
-        <w:t>Count</w:t>
-      </w:r>
-      <w:proofErr w:type="spellEnd"/>
+      <w:r>
+        <w:rPr>
+          <w:lang w:val="tr-TR"/>
+        </w:rPr>
+        <w:t>Column Count</w:t>
+      </w:r>
     </w:p>
     <w:p>
       <w:pPr>
@@ -2897,14 +2455,12 @@
           <w:lang w:val="tr-TR"/>
         </w:rPr>
       </w:pPr>
-      <w:proofErr w:type="spellStart"/>
       <w:r>
         <w:rPr>
           <w:lang w:val="tr-TR"/>
         </w:rPr>
         <w:t>Version</w:t>
       </w:r>
-      <w:proofErr w:type="spellEnd"/>
     </w:p>
     <w:p>
       <w:pPr>
@@ -2937,19 +2493,11 @@
           <w:lang w:val="tr-TR"/>
         </w:rPr>
       </w:pPr>
-      <w:proofErr w:type="spellStart"/>
-      <w:r>
-        <w:rPr>
-          <w:lang w:val="tr-TR"/>
-        </w:rPr>
-        <w:t>Created</w:t>
-      </w:r>
-      <w:proofErr w:type="spellEnd"/>
-      <w:r>
-        <w:rPr>
-          <w:lang w:val="tr-TR"/>
-        </w:rPr>
-        <w:t xml:space="preserve"> At</w:t>
+      <w:r>
+        <w:rPr>
+          <w:lang w:val="tr-TR"/>
+        </w:rPr>
+        <w:t>Created At</w:t>
       </w:r>
     </w:p>
     <w:p>
@@ -2983,19 +2531,11 @@
           <w:lang w:val="tr-TR"/>
         </w:rPr>
       </w:pPr>
-      <w:proofErr w:type="spellStart"/>
-      <w:r>
-        <w:rPr>
-          <w:lang w:val="tr-TR"/>
-        </w:rPr>
-        <w:t>Physical</w:t>
-      </w:r>
-      <w:proofErr w:type="spellEnd"/>
-      <w:r>
-        <w:rPr>
-          <w:lang w:val="tr-TR"/>
-        </w:rPr>
-        <w:t xml:space="preserve"> File Name</w:t>
+      <w:r>
+        <w:rPr>
+          <w:lang w:val="tr-TR"/>
+        </w:rPr>
+        <w:t>Physical File Name</w:t>
       </w:r>
     </w:p>
     <w:p>
@@ -3022,7 +2562,7 @@
           <w:lang w:val="tr-TR"/>
         </w:rPr>
         <w:pict w14:anchorId="52057739">
-          <v:rect id="_x0000_i1159" style="width:0;height:1.5pt" o:hralign="center" o:hrstd="t" o:hr="t" fillcolor="#a0a0a0" stroked="f"/>
+          <v:rect id="_x0000_i1026" style="width:0;height:1.5pt" o:hralign="center" o:hrstd="t" o:hr="t" fillcolor="#a0a0a0" stroked="f"/>
         </w:pict>
       </w:r>
     </w:p>
@@ -3038,21 +2578,7 @@
           <w:lang w:val="tr-TR"/>
         </w:rPr>
         <w:lastRenderedPageBreak/>
-        <w:t xml:space="preserve">9. </w:t>
-      </w:r>
-      <w:proofErr w:type="spellStart"/>
-      <w:r>
-        <w:rPr>
-          <w:lang w:val="tr-TR"/>
-        </w:rPr>
-        <w:t>Column</w:t>
-      </w:r>
-      <w:proofErr w:type="spellEnd"/>
-      <w:r>
-        <w:rPr>
-          <w:lang w:val="tr-TR"/>
-        </w:rPr>
-        <w:t xml:space="preserve"> Yapısı</w:t>
+        <w:t>9. Column Yapısı</w:t>
       </w:r>
     </w:p>
     <w:p>
@@ -3080,14 +2606,12 @@
           <w:lang w:val="tr-TR"/>
         </w:rPr>
       </w:pPr>
-      <w:proofErr w:type="spellStart"/>
       <w:r>
         <w:rPr>
           <w:lang w:val="tr-TR"/>
         </w:rPr>
         <w:t>Column</w:t>
       </w:r>
-      <w:proofErr w:type="spellEnd"/>
     </w:p>
     <w:p>
       <w:pPr>
@@ -3138,16 +2662,8 @@
         <w:rPr>
           <w:lang w:val="tr-TR"/>
         </w:rPr>
-        <w:t xml:space="preserve">└── </w:t>
-      </w:r>
-      <w:proofErr w:type="spellStart"/>
-      <w:r>
-        <w:rPr>
-          <w:lang w:val="tr-TR"/>
-        </w:rPr>
-        <w:t>dataType</w:t>
-      </w:r>
-      <w:proofErr w:type="spellEnd"/>
+        <w:t>└── dataType</w:t>
+      </w:r>
     </w:p>
     <w:p>
       <w:pPr>
@@ -3234,7 +2750,6 @@
           <w:lang w:val="tr-TR"/>
         </w:rPr>
       </w:pPr>
-      <w:proofErr w:type="spellStart"/>
       <w:proofErr w:type="gramStart"/>
       <w:r>
         <w:rPr>
@@ -3242,7 +2757,6 @@
         </w:rPr>
         <w:t>price</w:t>
       </w:r>
-      <w:proofErr w:type="spellEnd"/>
       <w:proofErr w:type="gramEnd"/>
       <w:r>
         <w:rPr>
@@ -3265,7 +2779,6 @@
           <w:lang w:val="tr-TR"/>
         </w:rPr>
       </w:pPr>
-      <w:proofErr w:type="spellStart"/>
       <w:proofErr w:type="gramStart"/>
       <w:r>
         <w:rPr>
@@ -3273,7 +2786,6 @@
         </w:rPr>
         <w:t>active</w:t>
       </w:r>
-      <w:proofErr w:type="spellEnd"/>
       <w:proofErr w:type="gramEnd"/>
       <w:r>
         <w:rPr>
@@ -3293,21 +2805,7 @@
         <w:rPr>
           <w:lang w:val="tr-TR"/>
         </w:rPr>
-        <w:t xml:space="preserve">10. </w:t>
-      </w:r>
-      <w:proofErr w:type="spellStart"/>
-      <w:r>
-        <w:rPr>
-          <w:lang w:val="tr-TR"/>
-        </w:rPr>
-        <w:t>DataType</w:t>
-      </w:r>
-      <w:proofErr w:type="spellEnd"/>
-      <w:r>
-        <w:rPr>
-          <w:lang w:val="tr-TR"/>
-        </w:rPr>
-        <w:t xml:space="preserve"> Yapısı</w:t>
+        <w:t>10. DataType Yapısı</w:t>
       </w:r>
     </w:p>
     <w:p>
@@ -3672,14 +3170,12 @@
           <w:lang w:val="tr-TR"/>
         </w:rPr>
       </w:pPr>
-      <w:proofErr w:type="spellStart"/>
       <w:r>
         <w:rPr>
           <w:lang w:val="tr-TR"/>
         </w:rPr>
         <w:t>TableManager</w:t>
       </w:r>
-      <w:proofErr w:type="spellEnd"/>
     </w:p>
     <w:p>
       <w:pPr>
@@ -3700,28 +3196,12 @@
           <w:lang w:val="tr-TR"/>
         </w:rPr>
       </w:pPr>
-      <w:proofErr w:type="spellStart"/>
-      <w:r>
-        <w:rPr>
-          <w:lang w:val="tr-TR"/>
-        </w:rPr>
-        <w:t>Schema</w:t>
-      </w:r>
-      <w:proofErr w:type="spellEnd"/>
-      <w:r>
-        <w:rPr>
-          <w:lang w:val="tr-TR"/>
-        </w:rPr>
-        <w:t xml:space="preserve"> </w:t>
-      </w:r>
-      <w:proofErr w:type="spellStart"/>
-      <w:r>
-        <w:rPr>
-          <w:lang w:val="tr-TR"/>
-        </w:rPr>
-        <w:t>Validation</w:t>
-      </w:r>
-      <w:proofErr w:type="spellEnd"/>
+      <w:r>
+        <w:rPr>
+          <w:lang w:val="tr-TR"/>
+        </w:rPr>
+        <w:t>Schema Validation</w:t>
+      </w:r>
     </w:p>
     <w:p>
       <w:pPr>
@@ -3769,14 +3249,12 @@
           <w:lang w:val="tr-TR"/>
         </w:rPr>
       </w:pPr>
-      <w:proofErr w:type="spellStart"/>
       <w:r>
         <w:rPr>
           <w:lang w:val="tr-TR"/>
         </w:rPr>
         <w:t>users.tbl</w:t>
       </w:r>
-      <w:proofErr w:type="spellEnd"/>
     </w:p>
     <w:p>
       <w:pPr>
@@ -3797,28 +3275,12 @@
           <w:lang w:val="tr-TR"/>
         </w:rPr>
       </w:pPr>
-      <w:proofErr w:type="spellStart"/>
-      <w:r>
-        <w:rPr>
-          <w:lang w:val="tr-TR"/>
-        </w:rPr>
-        <w:t>Catalog</w:t>
-      </w:r>
-      <w:proofErr w:type="spellEnd"/>
-      <w:r>
-        <w:rPr>
-          <w:lang w:val="tr-TR"/>
-        </w:rPr>
-        <w:t xml:space="preserve"> </w:t>
-      </w:r>
-      <w:proofErr w:type="spellStart"/>
-      <w:r>
-        <w:rPr>
-          <w:lang w:val="tr-TR"/>
-        </w:rPr>
-        <w:t>Registration</w:t>
-      </w:r>
-      <w:proofErr w:type="spellEnd"/>
+      <w:r>
+        <w:rPr>
+          <w:lang w:val="tr-TR"/>
+        </w:rPr>
+        <w:t>Catalog Registration</w:t>
+      </w:r>
     </w:p>
     <w:p>
       <w:pPr>
@@ -3839,14 +3301,12 @@
           <w:lang w:val="tr-TR"/>
         </w:rPr>
       </w:pPr>
-      <w:proofErr w:type="spellStart"/>
       <w:r>
         <w:rPr>
           <w:lang w:val="tr-TR"/>
         </w:rPr>
         <w:t>Success</w:t>
       </w:r>
-      <w:proofErr w:type="spellEnd"/>
     </w:p>
     <w:p>
       <w:pPr>
@@ -3913,85 +3373,47 @@
         <w:rPr>
           <w:lang w:val="tr-TR"/>
         </w:rPr>
-        <w:t xml:space="preserve">└── </w:t>
-      </w:r>
-      <w:proofErr w:type="spellStart"/>
-      <w:r>
-        <w:rPr>
-          <w:lang w:val="tr-TR"/>
-        </w:rPr>
-        <w:t>company</w:t>
-      </w:r>
-      <w:proofErr w:type="spellEnd"/>
-      <w:r>
-        <w:rPr>
-          <w:lang w:val="tr-TR"/>
-        </w:rPr>
-        <w:t>/</w:t>
-      </w:r>
-    </w:p>
-    <w:p>
-      <w:pPr>
-        <w:rPr>
-          <w:lang w:val="tr-TR"/>
-        </w:rPr>
-      </w:pPr>
-      <w:r>
-        <w:rPr>
-          <w:lang w:val="tr-TR"/>
-        </w:rPr>
-        <w:t xml:space="preserve">      </w:t>
-      </w:r>
-      <w:proofErr w:type="spellStart"/>
-      <w:r>
-        <w:rPr>
-          <w:lang w:val="tr-TR"/>
-        </w:rPr>
-        <w:t>users.tbl</w:t>
-      </w:r>
-      <w:proofErr w:type="spellEnd"/>
-    </w:p>
-    <w:p>
-      <w:pPr>
-        <w:rPr>
-          <w:lang w:val="tr-TR"/>
-        </w:rPr>
-      </w:pPr>
-      <w:r>
-        <w:rPr>
-          <w:lang w:val="tr-TR"/>
-        </w:rPr>
-        <w:t xml:space="preserve">      </w:t>
-      </w:r>
-      <w:proofErr w:type="spellStart"/>
-      <w:r>
-        <w:rPr>
-          <w:lang w:val="tr-TR"/>
-        </w:rPr>
-        <w:t>products.tbl</w:t>
-      </w:r>
-      <w:proofErr w:type="spellEnd"/>
-    </w:p>
-    <w:p>
-      <w:pPr>
-        <w:rPr>
-          <w:lang w:val="tr-TR"/>
-        </w:rPr>
-      </w:pPr>
-      <w:r>
-        <w:rPr>
-          <w:lang w:val="tr-TR"/>
-        </w:rPr>
-        <w:t xml:space="preserve">      </w:t>
-      </w:r>
-      <w:proofErr w:type="spellStart"/>
-      <w:r>
-        <w:rPr>
-          <w:lang w:val="tr-TR"/>
-        </w:rPr>
-        <w:t>orders.tbl</w:t>
-      </w:r>
-      <w:proofErr w:type="spellEnd"/>
+        <w:t>└── company/</w:t>
+      </w:r>
+    </w:p>
+    <w:p>
+      <w:pPr>
+        <w:rPr>
+          <w:lang w:val="tr-TR"/>
+        </w:rPr>
+      </w:pPr>
+      <w:r>
+        <w:rPr>
+          <w:lang w:val="tr-TR"/>
+        </w:rPr>
+        <w:t xml:space="preserve">      users.tbl</w:t>
+      </w:r>
+    </w:p>
+    <w:p>
+      <w:pPr>
+        <w:rPr>
+          <w:lang w:val="tr-TR"/>
+        </w:rPr>
+      </w:pPr>
+      <w:r>
+        <w:rPr>
+          <w:lang w:val="tr-TR"/>
+        </w:rPr>
+        <w:t xml:space="preserve">      products.tbl</w:t>
+      </w:r>
+    </w:p>
+    <w:p>
+      <w:pPr>
+        <w:rPr>
+          <w:lang w:val="tr-TR"/>
+        </w:rPr>
+      </w:pPr>
+      <w:r>
+        <w:rPr>
+          <w:lang w:val="tr-TR"/>
+        </w:rPr>
+        <w:t xml:space="preserve">      orders.tbl</w:t>
+      </w:r>
     </w:p>
     <w:p>
       <w:pPr>
@@ -4193,19 +3615,11 @@
           <w:lang w:val="tr-TR"/>
         </w:rPr>
       </w:pPr>
-      <w:proofErr w:type="spellStart"/>
-      <w:r>
-        <w:rPr>
-          <w:lang w:val="tr-TR"/>
-        </w:rPr>
-        <w:t>TableManager</w:t>
-      </w:r>
-      <w:proofErr w:type="spellEnd"/>
-      <w:r>
-        <w:rPr>
-          <w:lang w:val="tr-TR"/>
-        </w:rPr>
-        <w:t xml:space="preserve"> aşağıdaki kontrolleri gerçekleştirmektedir.</w:t>
+      <w:r>
+        <w:rPr>
+          <w:lang w:val="tr-TR"/>
+        </w:rPr>
+        <w:t>TableManager aşağıdaki kontrolleri gerçekleştirmektedir.</w:t>
       </w:r>
     </w:p>
     <w:p>
@@ -4225,21 +3639,7 @@
         <w:rPr>
           <w:lang w:val="tr-TR"/>
         </w:rPr>
-        <w:t xml:space="preserve"> </w:t>
-      </w:r>
-      <w:proofErr w:type="spellStart"/>
-      <w:r>
-        <w:rPr>
-          <w:lang w:val="tr-TR"/>
-        </w:rPr>
-        <w:t>Null</w:t>
-      </w:r>
-      <w:proofErr w:type="spellEnd"/>
-      <w:r>
-        <w:rPr>
-          <w:lang w:val="tr-TR"/>
-        </w:rPr>
-        <w:t xml:space="preserve"> tablo adı</w:t>
+        <w:t xml:space="preserve"> Null tablo adı</w:t>
       </w:r>
     </w:p>
     <w:p>
@@ -4279,21 +3679,7 @@
         <w:rPr>
           <w:lang w:val="tr-TR"/>
         </w:rPr>
-        <w:t xml:space="preserve"> </w:t>
-      </w:r>
-      <w:proofErr w:type="spellStart"/>
-      <w:r>
-        <w:rPr>
-          <w:lang w:val="tr-TR"/>
-        </w:rPr>
-        <w:t>Duplicate</w:t>
-      </w:r>
-      <w:proofErr w:type="spellEnd"/>
-      <w:r>
-        <w:rPr>
-          <w:lang w:val="tr-TR"/>
-        </w:rPr>
-        <w:t xml:space="preserve"> tablo</w:t>
+        <w:t xml:space="preserve"> Duplicate tablo</w:t>
       </w:r>
     </w:p>
     <w:p>
@@ -4313,21 +3699,7 @@
         <w:rPr>
           <w:lang w:val="tr-TR"/>
         </w:rPr>
-        <w:t xml:space="preserve"> </w:t>
-      </w:r>
-      <w:proofErr w:type="spellStart"/>
-      <w:r>
-        <w:rPr>
-          <w:lang w:val="tr-TR"/>
-        </w:rPr>
-        <w:t>Duplicate</w:t>
-      </w:r>
-      <w:proofErr w:type="spellEnd"/>
-      <w:r>
-        <w:rPr>
-          <w:lang w:val="tr-TR"/>
-        </w:rPr>
-        <w:t xml:space="preserve"> sütun</w:t>
+        <w:t xml:space="preserve"> Duplicate sütun</w:t>
       </w:r>
     </w:p>
     <w:p>
@@ -4347,30 +3719,8 @@
         <w:rPr>
           <w:lang w:val="tr-TR"/>
         </w:rPr>
-        <w:t xml:space="preserve"> </w:t>
-      </w:r>
-      <w:proofErr w:type="spellStart"/>
-      <w:r>
-        <w:rPr>
-          <w:lang w:val="tr-TR"/>
-        </w:rPr>
-        <w:t>Null</w:t>
-      </w:r>
-      <w:proofErr w:type="spellEnd"/>
-      <w:r>
-        <w:rPr>
-          <w:lang w:val="tr-TR"/>
-        </w:rPr>
-        <w:t xml:space="preserve"> </w:t>
-      </w:r>
-      <w:proofErr w:type="spellStart"/>
-      <w:r>
-        <w:rPr>
-          <w:lang w:val="tr-TR"/>
-        </w:rPr>
-        <w:t>DataType</w:t>
-      </w:r>
-      <w:proofErr w:type="spellEnd"/>
+        <w:t xml:space="preserve"> Null DataType</w:t>
+      </w:r>
     </w:p>
     <w:p>
       <w:pPr>
@@ -4499,7 +3849,6 @@
           <w:lang w:val="tr-TR"/>
         </w:rPr>
       </w:pPr>
-      <w:proofErr w:type="spellStart"/>
       <w:proofErr w:type="gramStart"/>
       <w:r>
         <w:rPr>
@@ -4507,7 +3856,6 @@
         </w:rPr>
         <w:t>immutable</w:t>
       </w:r>
-      <w:proofErr w:type="spellEnd"/>
       <w:proofErr w:type="gramEnd"/>
       <w:r>
         <w:rPr>
@@ -4522,19 +3870,11 @@
           <w:lang w:val="tr-TR"/>
         </w:rPr>
       </w:pPr>
-      <w:proofErr w:type="spellStart"/>
-      <w:r>
-        <w:rPr>
-          <w:lang w:val="tr-TR"/>
-        </w:rPr>
-        <w:t>LinkedHashMap</w:t>
-      </w:r>
-      <w:proofErr w:type="spellEnd"/>
-      <w:r>
-        <w:rPr>
-          <w:lang w:val="tr-TR"/>
-        </w:rPr>
-        <w:t xml:space="preserve"> ile sıralamayı korumaktadır, </w:t>
+      <w:r>
+        <w:rPr>
+          <w:lang w:val="tr-TR"/>
+        </w:rPr>
+        <w:t xml:space="preserve">LinkedHashMap ile sıralamayı korumaktadır, </w:t>
       </w:r>
     </w:p>
     <w:p>
@@ -4645,62 +3985,20 @@
         <w:rPr>
           <w:lang w:val="tr-TR"/>
         </w:rPr>
-        <w:t xml:space="preserve"> YEKDB artık yalnızca </w:t>
-      </w:r>
-      <w:proofErr w:type="spellStart"/>
-      <w:r>
-        <w:rPr>
-          <w:lang w:val="tr-TR"/>
-        </w:rPr>
-        <w:t>veritabanı</w:t>
-      </w:r>
-      <w:proofErr w:type="spellEnd"/>
-      <w:r>
-        <w:rPr>
-          <w:lang w:val="tr-TR"/>
-        </w:rPr>
-        <w:t xml:space="preserve"> yönetebilen bir sistem olmaktan çıkmış, tablo yönetimini de destekleyen modüler bir </w:t>
-      </w:r>
-      <w:proofErr w:type="spellStart"/>
-      <w:r>
-        <w:rPr>
-          <w:lang w:val="tr-TR"/>
-        </w:rPr>
-        <w:t>veritabanı</w:t>
-      </w:r>
-      <w:proofErr w:type="spellEnd"/>
-      <w:r>
-        <w:rPr>
-          <w:lang w:val="tr-TR"/>
-        </w:rPr>
-        <w:t xml:space="preserve"> yönetim sistemi hâline gelmiştir.</w:t>
-      </w:r>
-    </w:p>
-    <w:p>
-      <w:pPr>
-        <w:rPr>
-          <w:lang w:val="tr-TR"/>
-        </w:rPr>
-      </w:pPr>
-      <w:r>
-        <w:rPr>
-          <w:lang w:val="tr-TR"/>
-        </w:rPr>
-        <w:t>Bu sprintte geliştirilen mimari, kayıt yönetimi (</w:t>
-      </w:r>
-      <w:proofErr w:type="spellStart"/>
-      <w:r>
-        <w:rPr>
-          <w:lang w:val="tr-TR"/>
-        </w:rPr>
-        <w:t>Record</w:t>
-      </w:r>
-      <w:proofErr w:type="spellEnd"/>
-      <w:r>
-        <w:rPr>
-          <w:lang w:val="tr-TR"/>
-        </w:rPr>
-        <w:t xml:space="preserve"> Management) ve SQL komutlarının uygulanması için gerekli altyapıyı sağlamaktadır.</w:t>
+        <w:t xml:space="preserve"> YEKDB artık yalnızca veritabanı yönetebilen bir sistem olmaktan çıkmış, tablo yönetimini de destekleyen modüler bir veritabanı yönetim sistemi hâline gelmiştir.</w:t>
+      </w:r>
+    </w:p>
+    <w:p>
+      <w:pPr>
+        <w:rPr>
+          <w:lang w:val="tr-TR"/>
+        </w:rPr>
+      </w:pPr>
+      <w:r>
+        <w:rPr>
+          <w:lang w:val="tr-TR"/>
+        </w:rPr>
+        <w:t>Bu sprintte geliştirilen mimari, kayıt yönetimi (Record Management) ve SQL komutlarının uygulanması için gerekli altyapıyı sağlamaktadır.</w:t>
       </w:r>
     </w:p>
     <w:p>
@@ -4855,19 +4153,11 @@
                 <w:lang w:val="tr-TR"/>
               </w:rPr>
             </w:pPr>
-            <w:proofErr w:type="spellStart"/>
             <w:r>
               <w:rPr>
                 <w:lang w:val="tr-TR"/>
               </w:rPr>
-              <w:t>Exception</w:t>
-            </w:r>
-            <w:proofErr w:type="spellEnd"/>
-            <w:r>
-              <w:rPr>
-                <w:lang w:val="tr-TR"/>
-              </w:rPr>
-              <w:t xml:space="preserve"> Sınıfı</w:t>
+              <w:t>Exception Sınıfı</w:t>
             </w:r>
           </w:p>
         </w:tc>
@@ -4933,16 +4223,8 @@
               <w:rPr>
                 <w:lang w:val="tr-TR"/>
               </w:rPr>
-              <w:t>.</w:t>
+              <w:t>.tbl</w:t>
             </w:r>
-            <w:proofErr w:type="spellStart"/>
-            <w:r>
-              <w:rPr>
-                <w:lang w:val="tr-TR"/>
-              </w:rPr>
-              <w:t>tbl</w:t>
-            </w:r>
-            <w:proofErr w:type="spellEnd"/>
             <w:proofErr w:type="gramEnd"/>
           </w:p>
         </w:tc>
@@ -5008,19 +4290,11 @@
                 <w:lang w:val="tr-TR"/>
               </w:rPr>
             </w:pPr>
-            <w:proofErr w:type="spellStart"/>
             <w:r>
               <w:rPr>
                 <w:lang w:val="tr-TR"/>
               </w:rPr>
-              <w:t>JUnit</w:t>
-            </w:r>
-            <w:proofErr w:type="spellEnd"/>
-            <w:r>
-              <w:rPr>
-                <w:lang w:val="tr-TR"/>
-              </w:rPr>
-              <w:t xml:space="preserve"> Testi</w:t>
+              <w:t>JUnit Testi</w:t>
             </w:r>
           </w:p>
         </w:tc>
@@ -6516,6 +5790,7 @@
   <w:style w:type="character" w:default="1" w:styleId="VarsaylanParagrafYazTipi">
     <w:name w:val="Default Paragraph Font"/>
     <w:uiPriority w:val="1"/>
+    <w:semiHidden/>
     <w:unhideWhenUsed/>
   </w:style>
   <w:style w:type="table" w:default="1" w:styleId="NormalTablo">

</xml_diff>